<commit_message>
Artigo do Paraná: seção 2 (revisão da literatura) e referências atualizadas
Co-Authored-By: Claude Sonnet 5.5 <noreply@anthropic.com>
Claude-Session: https://claude.ai/code/session_011eEoECqArDQbSEYFrfCHxJ
</commit_message>
<xml_diff>
--- a/artigos/parana-ibs/artigo-parana-ibs.docx
+++ b/artigos/parana-ibs/artigo-parana-ibs.docx
@@ -243,7 +243,7 @@
         <w:pStyle w:val="FirstParagraph"/>
       </w:pPr>
       <w:r>
-        <w:t xml:space="preserve">O federalismo fiscal oferece o ponto de partida para compreender por que a reforma tributária produz efeitos distintos entre territórios. A literatura trata esse problema a partir da correspondência entre responsabilidades de gasto, fontes de receita e autonomia decisória em economias politicamente descentralizadas (Musgrave, 1959; Oates, 1972, 1999; Rosen e Gayer, 2014). A questão vai, portanto, além da simplificação das obrigações tributárias para empresas e contribuintes. Ao alterar a forma como a receita é apropriada e repartida, a reforma modifica a capacidade fiscal relativa de estados e municípios.</w:t>
+        <w:t xml:space="preserve">O federalismo fiscal tem entre suas questões centrais a relação entre a descentralização das funções de governo e a distribuição dos recursos necessários ao seu financiamento (Oates, 1999). No caso brasileiro, a repartição de receitas constitui uma dimensão importante das relações financeiras intergovernamentais e da autonomia dos governos subnacionais (Afonso, 1992). Na reforma da tributação do consumo, essa dimensão ganha relevância porque a simplificação e a harmonização das regras vêm acompanhadas de uma reorganização dos critérios de distribuição territorial da receita entre estados e municípios. Prado (2025) destaca justamente essa dimensão federativa da reforma, que vai além do desenho técnico do novo imposto e alcança a forma como os recursos são apropriados pelos diferentes entes.</w:t>
       </w:r>
     </w:p>
     <w:p>
@@ -251,7 +251,7 @@
         <w:pStyle w:val="BodyText"/>
       </w:pPr>
       <w:r>
-        <w:t xml:space="preserve">Uma tensão clássica do federalismo fiscal está no equilíbrio entre autonomia subnacional e coordenação nacional. A descentralização pode aproximar políticas públicas das preferências locais, sobretudo quando necessidades e custos diferem entre territórios. A autonomia fiscal, contudo, também pode gerar externalidades quando governos disputam bases móveis de arrecadação ou adotam políticas que afetam outros entes. O desenho tributário precisa, nesse caso, conciliar as vantagens da descentralização com os custos da competição entre jurisdições (Oates, 1972, 1999; Ter-Minassian, 1997).</w:t>
+        <w:t xml:space="preserve">Nos impostos sobre valor agregado, uma questão de desenho é definir a qual jurisdição será atribuída a receita de cada operação. Em termos gerais, pelo princípio da origem, essa receita mantém maior vínculo com o território em que ocorre a produção; pelo princípio do destino, acompanha o local do consumo final. Nesse desenho, a adoção do destino é associada à tributação no local do consumo e à maior neutralidade nas decisões de produção e comércio (OECD, 2017). No caso brasileiro, o ICMS combinou elementos de origem e destino, mas preservou vínculo relevante entre a localização da atividade econômica e a receita estadual (Baratto e Macedo, 2007). Com a reforma, o IBS desloca progressivamente essa apropriação para o destino, embora a transição preserve parcela expressiva da distribuição histórica da receita; ainda assim, a combinação dos dois critérios pode alterar a posição fiscal relativa de estados e municípios em relação ao sistema vigente, em magnitude que depende da posição de cada ente em ambos (Brasil, 2023; Brasil, 2026).</w:t>
       </w:r>
     </w:p>
     <w:p>
@@ -259,7 +259,7 @@
         <w:pStyle w:val="BodyText"/>
       </w:pPr>
       <w:r>
-        <w:t xml:space="preserve">Nos tributos sobre o consumo, essa tensão se traduz na escolha entre origem e destino. Sob a origem, a receita permanece mais próxima do território onde ocorre a produção ou a circulação econômica; sob o destino, acompanha o local do consumo final. A literatura internacional sobre impostos sobre valor agregado associa o princípio do destino a maior neutralidade nas decisões de produção e comércio (Ebrill et al., 2001; Keen, 2013). Essa maior neutralidade, contudo, produz efeitos distributivos quando produção e consumo estão localizados em territórios diferentes.</w:t>
+        <w:t xml:space="preserve">A literatura quantitativa sobre a reforma tributária brasileira avançou nos últimos anos, embora permaneça relativamente limitada em extensão e escopo. Os estudos disponíveis apontam ganhos potenciais de eficiência e bem-estar decorrentes da redução da cumulatividade e da dispersão de alíquotas (Delalibera et al., 2024), mas também mostram que esses efeitos podem se distribuir de forma desigual entre regiões e atividades econômicas (Haddad, Araújo e Sacco, 2023). Cebreiro Gomez et al. (2025), por sua vez, mostram que a neutralidade da arrecadação agregada depende de hipóteses sobre conformidade tributária, informalidade e funcionamento do mecanismo de créditos. Apesar desses avanços, a base acadêmica acumulada ainda é estreita: Araújo et al. (2024) identificam apenas 16 artigos de periódico sobre reforma tributária no Brasil ao longo de 23 anos. A evidência existente indica, portanto, efeitos economicamente relevantes e heterogêneos, mas deixa espaço para análises mais específicas de sua dimensão federativa e distributiva.</w:t>
       </w:r>
     </w:p>
     <w:p>
@@ -267,7 +267,43 @@
         <w:pStyle w:val="BodyText"/>
       </w:pPr>
       <w:r>
-        <w:t xml:space="preserve">No Brasil, essa tensão assumiu uma forma particular no ICMS. Embora combinasse elementos de origem e destino, o imposto preservou vínculo relevante entre atividade produtiva e arrecadação estadual (Baratto e Macedo, 2007). Esse vínculo também sustentou o uso de benefícios e regimes especiais na disputa por investimentos, estratégia associada pela literatura à guerra fiscal e a custos de eficiência (Varsano, 1997). No Paraná, Nascimento (2002) analisou empiricamente os efeitos dessa competição sobre a arrecadação estadual de ICMS. O IBS altera os dois canais que sustentavam esse mecanismo: restringe o uso do imposto como instrumento de atração e reduz o retorno fiscal direto da localização produtiva quando o consumo final ocorre em outro território.</w:t>
+        <w:t xml:space="preserve">Na dimensão federativa, Orair e Gobetti (2021) e Gobetti e Monteiro (2023) oferecem os antecedentes quantitativos mais próximos da questão analisada neste artigo. O primeiro estudo estima alíquotas neutras e simula os efeitos de uma partilha baseada no destino; o segundo atualiza o exercício com dados de 2022 e o texto então aprovado pela Câmara dos Deputados, estimando a distribuição da receita entre estados e municípios. Os resultados apontam ganhos relativos para 60% dos estados e 82% dos municípios; no caso específico do Paraná, a receita conjunta do Estado e de seus municípios aumentaria cerca de 15,7% em relação ao sistema então vigente (Gobetti e Monteiro, 2023). Essas estimativas constituem uma referência importante para a direção e a magnitude da redistribuição. Contudo, foram produzidas antes da consolidação do desenho normativo atual, com a promulgação da EC </w:t>
+      </w:r>
+      <w:r>
+        <w:t xml:space="preserve">n.</w:t>
+      </w:r>
+      <w:r>
+        <w:rPr>
+          <w:vertAlign w:val="superscript"/>
+        </w:rPr>
+        <w:t xml:space="preserve">o</w:t>
+      </w:r>
+      <w:r>
+        <w:t xml:space="preserve"> 132/2023 e, posteriormente, das Leis Complementares </w:t>
+      </w:r>
+      <w:r>
+        <w:t xml:space="preserve">n.</w:t>
+      </w:r>
+      <w:r>
+        <w:rPr>
+          <w:vertAlign w:val="superscript"/>
+        </w:rPr>
+        <w:t xml:space="preserve">o</w:t>
+      </w:r>
+      <w:r>
+        <w:t xml:space="preserve"> 214/2025 e </w:t>
+      </w:r>
+      <w:r>
+        <w:t xml:space="preserve">n.</w:t>
+      </w:r>
+      <w:r>
+        <w:rPr>
+          <w:vertAlign w:val="superscript"/>
+        </w:rPr>
+        <w:t xml:space="preserve">o</w:t>
+      </w:r>
+      <w:r>
+        <w:t xml:space="preserve"> 227/2026, que detalharam a incidência no destino e os mecanismos de formação e distribuição da receita durante a transição.</w:t>
       </w:r>
     </w:p>
     <w:p>
@@ -275,41 +311,7 @@
         <w:pStyle w:val="BodyText"/>
       </w:pPr>
       <w:r>
-        <w:t xml:space="preserve">A redistribuição alcança também os municípios por meio das novas regras de repartição. No Paraná, 65% do Índice de Participação dos Municípios depende atualmente do Valor Adicionado Fiscal, enquanto no IBS 80% da cota-parte estadual será distribuída segundo a população. Prado (2025) observa que, no Sul e Sudeste, essa mudança pode produzir efeitos assimétricos porque população e geração de valor adicionado apresentam distribuições territoriais distintas. Em escala nacional, Gobetti e Monteiro (2023) também identificam efeitos redistributivos particularmente relevantes entre municípios.</w:t>
-      </w:r>
-    </w:p>
-    <w:p>
-      <w:pPr>
-        <w:pStyle w:val="BodyText"/>
-      </w:pPr>
-      <w:r>
-        <w:t xml:space="preserve">A transição federativa faz com que esses efeitos se manifestem gradualmente. A EC n.</w:t>
-      </w:r>
-      <w:r>
-        <w:rPr>
-          <w:vertAlign w:val="superscript"/>
-        </w:rPr>
-        <w:t xml:space="preserve">o</w:t>
-      </w:r>
-      <w:r>
-        <w:t xml:space="preserve"> 132/2023 e a LC n.</w:t>
-      </w:r>
-      <w:r>
-        <w:rPr>
-          <w:vertAlign w:val="superscript"/>
-        </w:rPr>
-        <w:t xml:space="preserve">o</w:t>
-      </w:r>
-      <w:r>
-        <w:t xml:space="preserve"> 227/2026 preservam por décadas uma parcela da receita vinculada à participação histórica dos entes; em 2033, primeiro ano sem ICMS e ISS, esse componente ainda responde por 90% do IBS. Depois disso, seu peso diminui progressivamente até 2077. A trajetória de curto prazo depende, portanto, sobretudo da posição herdada do sistema anterior, enquanto os novos critérios ganham influência à medida que a transição avança.</w:t>
-      </w:r>
-    </w:p>
-    <w:p>
-      <w:pPr>
-        <w:pStyle w:val="BodyText"/>
-      </w:pPr>
-      <w:r>
-        <w:t xml:space="preserve">A redistribuição produzida pelo IBS é, portanto, parte constitutiva da nova arquitetura federativa. Para o Paraná, a questão empírica é mensurar a magnitude e o ritmo com que a transição altera a participação do Estado na receita nacional e redistribui recursos entre seus municípios. A seção seguinte operacionaliza esse problema ao estimar as participações histórica e de destino do Paraná e de seus municípios e projetar sua combinação ao longo da transição.</w:t>
+        <w:t xml:space="preserve">Permanece, contudo, uma lacuna entre as estimativas da redistribuição associada ao destino e a mensuração da receita efetivamente apropriada pelos entes ao longo da transição. Essa distinção é particularmente relevante entre 2029 e 2033, quando a substituição gradual do ICMS e do ISS pelo IBS convive com a preservação de parcela expressiva da distribuição histórica da receita e com os demais mecanismos definidos pela regulamentação posterior. Este estudo avança nessa direção ao combinar, para o Paraná e seus municípios, a receita remanescente dos tributos atuais, os coeficientes histórico e de destino e os mecanismos de retenção e redistribuição previstos na legislação vigente, comparando a trajetória resultante com um cenário sem reforma. A seção seguinte apresenta a estratégia utilizada para operacionalizar essa comparação.</w:t>
       </w:r>
     </w:p>
     <w:bookmarkEnd w:id="10"/>
@@ -13277,6 +13279,98 @@
           <w:rFonts w:ascii="Times New Roman" w:hAnsi="Times New Roman"/>
           <w:sz w:val="22"/>
         </w:rPr>
+        <w:t xml:space="preserve">AFONSO, José Roberto Rodrigues. Aspectos conceituais das relações financeiras intergovernamentais. </w:t>
+      </w:r>
+      <w:r>
+        <w:rPr>
+          <w:rFonts w:ascii="Times New Roman" w:hAnsi="Times New Roman"/>
+          <w:i/>
+          <w:iCs/>
+          <w:sz w:val="22"/>
+        </w:rPr>
+        <w:t xml:space="preserve">Estudos Econômicos</w:t>
+      </w:r>
+      <w:r>
+        <w:rPr>
+          <w:rFonts w:ascii="Times New Roman" w:hAnsi="Times New Roman"/>
+          <w:sz w:val="22"/>
+        </w:rPr>
+        <w:t xml:space="preserve">, São Paulo, v. 22, n. 1, p. 5-34, 1992. DOI: 10.11606/1980-53572211jrra. Disponível em: </w:t>
+      </w:r>
+      <w:hyperlink r:id="rId17">
+        <w:r>
+          <w:rPr>
+            <w:rStyle w:val="Hyperlink"/>
+          </w:rPr>
+          <w:t xml:space="preserve">https://revistas.usp.br/ee/pt_BR/article/view/158775</w:t>
+        </w:r>
+      </w:hyperlink>
+      <w:r>
+        <w:rPr>
+          <w:rFonts w:ascii="Times New Roman" w:hAnsi="Times New Roman"/>
+          <w:sz w:val="22"/>
+        </w:rPr>
+        <w:t xml:space="preserve">. Acesso em: 8 out. 2026.</w:t>
+      </w:r>
+    </w:p>
+    <w:p>
+      <w:pPr>
+        <w:pStyle w:val="BodyText"/>
+        <w:spacing w:line="240" w:lineRule="auto" w:before="0" w:after="160"/>
+        <w:ind w:firstLine="0"/>
+        <w:jc w:val="left"/>
+      </w:pPr>
+      <w:r>
+        <w:rPr>
+          <w:rFonts w:ascii="Times New Roman" w:hAnsi="Times New Roman"/>
+          <w:sz w:val="22"/>
+        </w:rPr>
+        <w:t xml:space="preserve">ARAÚJO, Elisabete Soares de; LEITE, José Pedro Dias; MENEZES, Marco Antônio Silva; NUNES, Suzana Gilioli da Costa. Reforma tributária no Brasil: análise bibliométrica e revisão sistemática. </w:t>
+      </w:r>
+      <w:r>
+        <w:rPr>
+          <w:rFonts w:ascii="Times New Roman" w:hAnsi="Times New Roman"/>
+          <w:i/>
+          <w:iCs/>
+          <w:sz w:val="22"/>
+        </w:rPr>
+        <w:t xml:space="preserve">Revista do TCU</w:t>
+      </w:r>
+      <w:r>
+        <w:rPr>
+          <w:rFonts w:ascii="Times New Roman" w:hAnsi="Times New Roman"/>
+          <w:sz w:val="22"/>
+        </w:rPr>
+        <w:t xml:space="preserve">, Brasília, v. 154, n. 1, p. 32-51, 2024. DOI: 10.69518/rtcu.154.32-51. Disponível em: </w:t>
+      </w:r>
+      <w:hyperlink r:id="rId18">
+        <w:r>
+          <w:rPr>
+            <w:rStyle w:val="Hyperlink"/>
+          </w:rPr>
+          <w:t xml:space="preserve">https://revista.tcu.gov.br/ojs/index.php/RTCU/article/view/1929</w:t>
+        </w:r>
+      </w:hyperlink>
+      <w:r>
+        <w:rPr>
+          <w:rFonts w:ascii="Times New Roman" w:hAnsi="Times New Roman"/>
+          <w:sz w:val="22"/>
+        </w:rPr>
+        <w:t xml:space="preserve">. Acesso em: 8 out. 2026.</w:t>
+      </w:r>
+    </w:p>
+    <w:p>
+      <w:pPr>
+        <w:pStyle w:val="BodyText"/>
+        <w:spacing w:line="240" w:lineRule="auto" w:before="0" w:after="160"/>
+        <w:ind w:firstLine="0"/>
+        <w:jc w:val="left"/>
+      </w:pPr>
+      <w:r>
+        <w:rPr>
+          <w:rFonts w:ascii="Times New Roman" w:hAnsi="Times New Roman"/>
+          <w:sz w:val="22"/>
+        </w:rPr>
         <w:t xml:space="preserve">BANCO CENTRAL DO BRASIL.</w:t>
       </w:r>
       <w:r>
@@ -13574,14 +13668,7 @@
           <w:rFonts w:ascii="Times New Roman" w:hAnsi="Times New Roman"/>
           <w:sz w:val="22"/>
         </w:rPr>
-        <w:t xml:space="preserve">EBRILL, Liam; KEEN, Michael; BODIN, Jean-Paul; SUMMERS, Victoria (org.).</w:t>
-      </w:r>
-      <w:r>
-        <w:rPr>
-          <w:rFonts w:ascii="Times New Roman" w:hAnsi="Times New Roman"/>
-          <w:sz w:val="22"/>
-        </w:rPr>
-        <w:t xml:space="preserve"> </w:t>
+        <w:t xml:space="preserve">CEBREIRO GOMEZ, Ana; DAL PIZZOL, Guilherme; KOLERUS, Christina; MOREIRA, Pablo; PECHO, Miguel. </w:t>
       </w:r>
       <w:r>
         <w:rPr>
@@ -13590,36 +13677,29 @@
           <w:iCs/>
           <w:sz w:val="22"/>
         </w:rPr>
-        <w:t xml:space="preserve">The modern VAT</w:t>
+        <w:t xml:space="preserve">Brazil's VAT Reform: Ensuring Revenue Neutrality</w:t>
       </w:r>
       <w:r>
         <w:rPr>
           <w:rFonts w:ascii="Times New Roman" w:hAnsi="Times New Roman"/>
           <w:sz w:val="22"/>
         </w:rPr>
-        <w:t xml:space="preserve">. Washington, DC: International Monetary Fund, 2001. Disponível em:</w:t>
-      </w:r>
+        <w:t xml:space="preserve">. Washington, DC: International Monetary Fund, 2025. IMF Working Paper, n. 2025/266. DOI: 10.5089/9798229032971.001. Disponível em: </w:t>
+      </w:r>
+      <w:hyperlink r:id="rId16">
+        <w:r>
+          <w:rPr>
+            <w:rStyle w:val="Hyperlink"/>
+          </w:rPr>
+          <w:t xml:space="preserve">https://www.imf.org/en/publications/wp/issues/2025/12/19/brazil-s-vat-reform-ensuring-revenue-neutrality-572700</w:t>
+        </w:r>
+      </w:hyperlink>
       <w:r>
         <w:rPr>
           <w:rFonts w:ascii="Times New Roman" w:hAnsi="Times New Roman"/>
           <w:sz w:val="22"/>
         </w:rPr>
-        <w:t xml:space="preserve"> </w:t>
-      </w:r>
-      <w:hyperlink r:id="rId46">
-        <w:r>
-          <w:rPr>
-            <w:rStyle w:val="Hyperlink"/>
-          </w:rPr>
-          <w:t xml:space="preserve">https://www.imf.org/external/pubs/nft/2001/VAT/</w:t>
-        </w:r>
-      </w:hyperlink>
-      <w:r>
-        <w:rPr>
-          <w:rFonts w:ascii="Times New Roman" w:hAnsi="Times New Roman"/>
-          <w:sz w:val="22"/>
-        </w:rPr>
-        <w:t xml:space="preserve">. Acesso em: 29 jun. 2026.</w:t>
+        <w:t xml:space="preserve">. Acesso em: 8 out. 2026.</w:t>
       </w:r>
     </w:p>
     <w:p>
@@ -13634,6 +13714,52 @@
           <w:rFonts w:ascii="Times New Roman" w:hAnsi="Times New Roman"/>
           <w:sz w:val="22"/>
         </w:rPr>
+        <w:t xml:space="preserve">DELALIBERA, Bruno R.; FERREIRA, Pedro Cavalcanti; GOMES, Diego B. P.; SOARES, Johann. Tax reforms and network effects. </w:t>
+      </w:r>
+      <w:r>
+        <w:rPr>
+          <w:rFonts w:ascii="Times New Roman" w:hAnsi="Times New Roman"/>
+          <w:i/>
+          <w:iCs/>
+          <w:sz w:val="22"/>
+        </w:rPr>
+        <w:t xml:space="preserve">Journal of Economic Dynamics and Control</w:t>
+      </w:r>
+      <w:r>
+        <w:rPr>
+          <w:rFonts w:ascii="Times New Roman" w:hAnsi="Times New Roman"/>
+          <w:sz w:val="22"/>
+        </w:rPr>
+        <w:t xml:space="preserve">, v. 163, art. 104862, 2024. DOI: 10.1016/j.jedc.2024.104862. Disponível em: </w:t>
+      </w:r>
+      <w:hyperlink r:id="rId13">
+        <w:r>
+          <w:rPr>
+            <w:rStyle w:val="Hyperlink"/>
+          </w:rPr>
+          <w:t xml:space="preserve">https://www.sciencedirect.com/science/article/abs/pii/S016518892400054X</w:t>
+        </w:r>
+      </w:hyperlink>
+      <w:r>
+        <w:rPr>
+          <w:rFonts w:ascii="Times New Roman" w:hAnsi="Times New Roman"/>
+          <w:sz w:val="22"/>
+        </w:rPr>
+        <w:t xml:space="preserve">. Acesso em: 8 out. 2026.</w:t>
+      </w:r>
+    </w:p>
+    <w:p>
+      <w:pPr>
+        <w:pStyle w:val="BodyText"/>
+        <w:spacing w:line="240" w:lineRule="auto" w:before="0" w:after="160"/>
+        <w:ind w:firstLine="0"/>
+        <w:jc w:val="left"/>
+      </w:pPr>
+      <w:r>
+        <w:rPr>
+          <w:rFonts w:ascii="Times New Roman" w:hAnsi="Times New Roman"/>
+          <w:sz w:val="22"/>
+        </w:rPr>
         <w:t xml:space="preserve">GOBETTI, Sérgio Wulff; MONTEIRO, Priscila Kaiser. Impactos redistributivos da reforma tributária: estimativas atualizadas.</w:t>
       </w:r>
       <w:r>
@@ -13694,6 +13820,52 @@
           <w:rFonts w:ascii="Times New Roman" w:hAnsi="Times New Roman"/>
           <w:sz w:val="22"/>
         </w:rPr>
+        <w:t xml:space="preserve">HADDAD, Eduardo A.; ARAÚJO, Inácio F.; SACCO, João Gabriel. </w:t>
+      </w:r>
+      <w:r>
+        <w:rPr>
+          <w:rFonts w:ascii="Times New Roman" w:hAnsi="Times New Roman"/>
+          <w:i/>
+          <w:iCs/>
+          <w:sz w:val="22"/>
+        </w:rPr>
+        <w:t xml:space="preserve">Reforma tributária no Brasil: impactos regionais da PEC 45/2019</w:t>
+      </w:r>
+      <w:r>
+        <w:rPr>
+          <w:rFonts w:ascii="Times New Roman" w:hAnsi="Times New Roman"/>
+          <w:sz w:val="22"/>
+        </w:rPr>
+        <w:t xml:space="preserve">. São Paulo: NEREUS/USP, 2023. Disponível em: </w:t>
+      </w:r>
+      <w:hyperlink r:id="rId12">
+        <w:r>
+          <w:rPr>
+            <w:rStyle w:val="Hyperlink"/>
+          </w:rPr>
+          <w:t xml:space="preserve">https://www.usp.br/nereus/wp-content/uploads/TD_NEREUS_08_2023.pdf</w:t>
+        </w:r>
+      </w:hyperlink>
+      <w:r>
+        <w:rPr>
+          <w:rFonts w:ascii="Times New Roman" w:hAnsi="Times New Roman"/>
+          <w:sz w:val="22"/>
+        </w:rPr>
+        <w:t xml:space="preserve">. Acesso em: 8 out. 2026.</w:t>
+      </w:r>
+    </w:p>
+    <w:p>
+      <w:pPr>
+        <w:pStyle w:val="BodyText"/>
+        <w:spacing w:line="240" w:lineRule="auto" w:before="0" w:after="160"/>
+        <w:ind w:firstLine="0"/>
+        <w:jc w:val="left"/>
+      </w:pPr>
+      <w:r>
+        <w:rPr>
+          <w:rFonts w:ascii="Times New Roman" w:hAnsi="Times New Roman"/>
+          <w:sz w:val="22"/>
+        </w:rPr>
         <w:t xml:space="preserve">INSTITUTO BRASILEIRO DE GEOGRAFIA E ESTATÍSTICA (IBGE).</w:t>
       </w:r>
       <w:r>
@@ -14077,14 +14249,7 @@
           <w:rFonts w:ascii="Times New Roman" w:hAnsi="Times New Roman"/>
           <w:sz w:val="22"/>
         </w:rPr>
-        <w:t xml:space="preserve">KEEN, Michael. The anatomy of the VAT.</w:t>
-      </w:r>
-      <w:r>
-        <w:rPr>
-          <w:rFonts w:ascii="Times New Roman" w:hAnsi="Times New Roman"/>
-          <w:sz w:val="22"/>
-        </w:rPr>
-        <w:t xml:space="preserve"> </w:t>
+        <w:t xml:space="preserve">OATES, Wallace E. An essay on fiscal federalism. </w:t>
       </w:r>
       <w:r>
         <w:rPr>
@@ -14093,14 +14258,29 @@
           <w:iCs/>
           <w:sz w:val="22"/>
         </w:rPr>
-        <w:t xml:space="preserve">National Tax Journal</w:t>
+        <w:t xml:space="preserve">Journal of Economic Literature</w:t>
       </w:r>
       <w:r>
         <w:rPr>
           <w:rFonts w:ascii="Times New Roman" w:hAnsi="Times New Roman"/>
           <w:sz w:val="22"/>
         </w:rPr>
-        <w:t xml:space="preserve">, v. 66, n. 2, p. 423-446, 2013.</w:t>
+        <w:t xml:space="preserve">, v. 37, n. 3, p. 1120-1149, set. 1999. DOI: 10.1257/jel.37.3.1120. Disponível em: </w:t>
+      </w:r>
+      <w:hyperlink r:id="rId11">
+        <w:r>
+          <w:rPr>
+            <w:rStyle w:val="Hyperlink"/>
+          </w:rPr>
+          <w:t xml:space="preserve">https://www.aeaweb.org/articles?id=10.1257/jel.37.3.1120</w:t>
+        </w:r>
+      </w:hyperlink>
+      <w:r>
+        <w:rPr>
+          <w:rFonts w:ascii="Times New Roman" w:hAnsi="Times New Roman"/>
+          <w:sz w:val="22"/>
+        </w:rPr>
+        <w:t xml:space="preserve">. Acesso em: 8 out. 2026.</w:t>
       </w:r>
     </w:p>
     <w:p>
@@ -14115,14 +14295,7 @@
           <w:rFonts w:ascii="Times New Roman" w:hAnsi="Times New Roman"/>
           <w:sz w:val="22"/>
         </w:rPr>
-        <w:t xml:space="preserve">MUSGRAVE, Richard A.</w:t>
-      </w:r>
-      <w:r>
-        <w:rPr>
-          <w:rFonts w:ascii="Times New Roman" w:hAnsi="Times New Roman"/>
-          <w:sz w:val="22"/>
-        </w:rPr>
-        <w:t xml:space="preserve"> </w:t>
+        <w:t xml:space="preserve">OECD. </w:t>
       </w:r>
       <w:r>
         <w:rPr>
@@ -14131,14 +14304,29 @@
           <w:iCs/>
           <w:sz w:val="22"/>
         </w:rPr>
-        <w:t xml:space="preserve">The theory of public finance: a study in public economy</w:t>
+        <w:t xml:space="preserve">International VAT/GST Guidelines</w:t>
       </w:r>
       <w:r>
         <w:rPr>
           <w:rFonts w:ascii="Times New Roman" w:hAnsi="Times New Roman"/>
           <w:sz w:val="22"/>
         </w:rPr>
-        <w:t xml:space="preserve">. New York: McGraw-Hill, 1959.</w:t>
+        <w:t xml:space="preserve">. Paris: OECD Publishing, 2017. DOI: 10.1787/9789264271401-en. Disponível em: </w:t>
+      </w:r>
+      <w:hyperlink r:id="rId14">
+        <w:r>
+          <w:rPr>
+            <w:rStyle w:val="Hyperlink"/>
+          </w:rPr>
+          <w:t xml:space="preserve">https://www.oecd.org/en/publications/international-vat-gst-guidelines_9789264271401-en.html</w:t>
+        </w:r>
+      </w:hyperlink>
+      <w:r>
+        <w:rPr>
+          <w:rFonts w:ascii="Times New Roman" w:hAnsi="Times New Roman"/>
+          <w:sz w:val="22"/>
+        </w:rPr>
+        <w:t xml:space="preserve">. Acesso em: 8 out. 2026.</w:t>
       </w:r>
     </w:p>
     <w:p>
@@ -14153,14 +14341,7 @@
           <w:rFonts w:ascii="Times New Roman" w:hAnsi="Times New Roman"/>
           <w:sz w:val="22"/>
         </w:rPr>
-        <w:t xml:space="preserve">NASCIMENTO, Sidnei Pereira do. Lei de responsabilidade fiscal, reforma tributária e impactos na guerra fiscal: uma análise empírica para o estado do Paraná.</w:t>
-      </w:r>
-      <w:r>
-        <w:rPr>
-          <w:rFonts w:ascii="Times New Roman" w:hAnsi="Times New Roman"/>
-          <w:sz w:val="22"/>
-        </w:rPr>
-        <w:t xml:space="preserve"> </w:t>
+        <w:t xml:space="preserve">ORAIR, Rodrigo Octávio; GOBETTI, Sérgio Wulff. Reforma tributária e federalismo fiscal: uma análise das propostas de criação de um novo imposto sobre o valor adicionado para o Brasil. </w:t>
       </w:r>
       <w:r>
         <w:rPr>
@@ -14169,36 +14350,29 @@
           <w:iCs/>
           <w:sz w:val="22"/>
         </w:rPr>
-        <w:t xml:space="preserve">Revista Paranaense de Desenvolvimento</w:t>
+        <w:t xml:space="preserve">Cadernos de Finanças Públicas</w:t>
       </w:r>
       <w:r>
         <w:rPr>
           <w:rFonts w:ascii="Times New Roman" w:hAnsi="Times New Roman"/>
           <w:sz w:val="22"/>
         </w:rPr>
-        <w:t xml:space="preserve">, Curitiba, n. 103, p. 61-77, jul./dez. 2002. Disponível em:</w:t>
-      </w:r>
+        <w:t xml:space="preserve">, Brasília, v. 21, n. 1, p. 1-51, 2021. DOI: 10.55532/1806-8944.2021.131. Disponível em: </w:t>
+      </w:r>
+      <w:hyperlink r:id="rId15">
+        <w:r>
+          <w:rPr>
+            <w:rStyle w:val="Hyperlink"/>
+          </w:rPr>
+          <w:t xml:space="preserve">https://publicacoes.tesouro.gov.br/index.php/cadernos/article/view/131</w:t>
+        </w:r>
+      </w:hyperlink>
       <w:r>
         <w:rPr>
           <w:rFonts w:ascii="Times New Roman" w:hAnsi="Times New Roman"/>
           <w:sz w:val="22"/>
         </w:rPr>
-        <w:t xml:space="preserve"> </w:t>
-      </w:r>
-      <w:hyperlink r:id="rId53">
-        <w:r>
-          <w:rPr>
-            <w:rStyle w:val="Hyperlink"/>
-          </w:rPr>
-          <w:t xml:space="preserve">https://ipardes.emnuvens.com.br/revistaparanaense/article/view/203</w:t>
-        </w:r>
-      </w:hyperlink>
-      <w:r>
-        <w:rPr>
-          <w:rFonts w:ascii="Times New Roman" w:hAnsi="Times New Roman"/>
-          <w:sz w:val="22"/>
-        </w:rPr>
-        <w:t xml:space="preserve">. Acesso em: 30 set. 2026.</w:t>
+        <w:t xml:space="preserve">. Acesso em: 8 out. 2026.</w:t>
       </w:r>
     </w:p>
     <w:p>
@@ -14213,7 +14387,7 @@
           <w:rFonts w:ascii="Times New Roman" w:hAnsi="Times New Roman"/>
           <w:sz w:val="22"/>
         </w:rPr>
-        <w:t xml:space="preserve">OATES, Wallace E.</w:t>
+        <w:t xml:space="preserve">PARANÁ. Governo do Estado.</w:t>
       </w:r>
       <w:r>
         <w:rPr>
@@ -14229,14 +14403,36 @@
           <w:iCs/>
           <w:sz w:val="22"/>
         </w:rPr>
-        <w:t xml:space="preserve">Fiscal federalism</w:t>
+        <w:t xml:space="preserve">Portal da Transparência: repasses do Governo Estadual aos municípios</w:t>
       </w:r>
       <w:r>
         <w:rPr>
           <w:rFonts w:ascii="Times New Roman" w:hAnsi="Times New Roman"/>
           <w:sz w:val="22"/>
         </w:rPr>
-        <w:t xml:space="preserve">. New York: Harcourt Brace Jovanovich, 1972.</w:t>
+        <w:t xml:space="preserve">. Curitiba: Governo do Estado do Paraná, 2026. Disponível em:</w:t>
+      </w:r>
+      <w:r>
+        <w:rPr>
+          <w:rFonts w:ascii="Times New Roman" w:hAnsi="Times New Roman"/>
+          <w:sz w:val="22"/>
+        </w:rPr>
+        <w:t xml:space="preserve"> </w:t>
+      </w:r>
+      <w:hyperlink r:id="rId54">
+        <w:r>
+          <w:rPr>
+            <w:rStyle w:val="Hyperlink"/>
+          </w:rPr>
+          <w:t xml:space="preserve">https://www.transparencia.pr.gov.br/</w:t>
+        </w:r>
+      </w:hyperlink>
+      <w:r>
+        <w:rPr>
+          <w:rFonts w:ascii="Times New Roman" w:hAnsi="Times New Roman"/>
+          <w:sz w:val="22"/>
+        </w:rPr>
+        <w:t xml:space="preserve">. Acesso em: 30 set. 2026.</w:t>
       </w:r>
     </w:p>
     <w:p>
@@ -14251,7 +14447,7 @@
           <w:rFonts w:ascii="Times New Roman" w:hAnsi="Times New Roman"/>
           <w:sz w:val="22"/>
         </w:rPr>
-        <w:t xml:space="preserve">OATES, Wallace E. An essay on fiscal federalism.</w:t>
+        <w:t xml:space="preserve">PRADO, Sérgio.</w:t>
       </w:r>
       <w:r>
         <w:rPr>
@@ -14267,14 +14463,36 @@
           <w:iCs/>
           <w:sz w:val="22"/>
         </w:rPr>
-        <w:t xml:space="preserve">Journal of Economic Literature</w:t>
+        <w:t xml:space="preserve">A dimensão federativa da reforma tributária: uma síntese didática e vários pontos críticos</w:t>
       </w:r>
       <w:r>
         <w:rPr>
           <w:rFonts w:ascii="Times New Roman" w:hAnsi="Times New Roman"/>
           <w:sz w:val="22"/>
         </w:rPr>
-        <w:t xml:space="preserve">, v. 37, n. 3, p. 1120-1149, 1999.</w:t>
+        <w:t xml:space="preserve">. Redação final. [S. l.]: [s. n.], jun. 2025. Disponível em:</w:t>
+      </w:r>
+      <w:r>
+        <w:rPr>
+          <w:rFonts w:ascii="Times New Roman" w:hAnsi="Times New Roman"/>
+          <w:sz w:val="22"/>
+        </w:rPr>
+        <w:t xml:space="preserve"> </w:t>
+      </w:r>
+      <w:hyperlink r:id="rId55">
+        <w:r>
+          <w:rPr>
+            <w:rStyle w:val="Hyperlink"/>
+          </w:rPr>
+          <w:t xml:space="preserve">https://www.joserobertoafonso.com.br/wp-content/uploads/2025/08/A_DIMENSAO_FEDERATIVA_DA_REFORMA_TRIBUTARIA.pdf</w:t>
+        </w:r>
+      </w:hyperlink>
+      <w:r>
+        <w:rPr>
+          <w:rFonts w:ascii="Times New Roman" w:hAnsi="Times New Roman"/>
+          <w:sz w:val="22"/>
+        </w:rPr>
+        <w:t xml:space="preserve">. Acesso em: 10 jun. 2026.</w:t>
       </w:r>
     </w:p>
     <w:p>
@@ -14289,7 +14507,7 @@
           <w:rFonts w:ascii="Times New Roman" w:hAnsi="Times New Roman"/>
           <w:sz w:val="22"/>
         </w:rPr>
-        <w:t xml:space="preserve">PARANÁ. Governo do Estado.</w:t>
+        <w:t xml:space="preserve">SECRETARIA DO TESOURO NACIONAL (STN).</w:t>
       </w:r>
       <w:r>
         <w:rPr>
@@ -14305,14 +14523,28 @@
           <w:iCs/>
           <w:sz w:val="22"/>
         </w:rPr>
-        <w:t xml:space="preserve">Portal da Transparência: repasses do Governo Estadual aos municípios</w:t>
+        <w:t xml:space="preserve">Siconfi: Sistema de Informações Contábeis e Fiscais do Setor Público Brasileiro</w:t>
       </w:r>
       <w:r>
         <w:rPr>
           <w:rFonts w:ascii="Times New Roman" w:hAnsi="Times New Roman"/>
           <w:sz w:val="22"/>
         </w:rPr>
-        <w:t xml:space="preserve">. Curitiba: Governo do Estado do Paraná, 2026. Disponível em:</w:t>
+        <w:t xml:space="preserve">. Declaração de Contas Anuais, </w:t>
+      </w:r>
+      <w:r>
+        <w:rPr>
+          <w:rFonts w:ascii="Times New Roman" w:hAnsi="Times New Roman"/>
+          <w:sz w:val="22"/>
+        </w:rPr>
+        <w:t>Anexo I-C, 2019 a 2025, e Relatório Resumido da Execução Orçamentária (RREO), 2026.</w:t>
+      </w:r>
+      <w:r>
+        <w:rPr>
+          <w:rFonts w:ascii="Times New Roman" w:hAnsi="Times New Roman"/>
+          <w:sz w:val="22"/>
+        </w:rPr>
+        <w:t xml:space="preserve"> Brasília, DF: STN, 2026. Disponível em:</w:t>
       </w:r>
       <w:r>
         <w:rPr>
@@ -14321,12 +14553,12 @@
         </w:rPr>
         <w:t xml:space="preserve"> </w:t>
       </w:r>
-      <w:hyperlink r:id="rId54">
+      <w:hyperlink r:id="rId56">
         <w:r>
           <w:rPr>
             <w:rStyle w:val="Hyperlink"/>
           </w:rPr>
-          <w:t xml:space="preserve">https://www.transparencia.pr.gov.br/</w:t>
+          <w:t xml:space="preserve">https://siconfi.tesouro.gov.br/</w:t>
         </w:r>
       </w:hyperlink>
       <w:r>
@@ -14334,7 +14566,7 @@
           <w:rFonts w:ascii="Times New Roman" w:hAnsi="Times New Roman"/>
           <w:sz w:val="22"/>
         </w:rPr>
-        <w:t xml:space="preserve">. Acesso em: 30 set. 2026.</w:t>
+        <w:t xml:space="preserve">. Acesso em: 8 ago. 2026.</w:t>
       </w:r>
     </w:p>
     <w:p>
@@ -14349,216 +14581,6 @@
           <w:rFonts w:ascii="Times New Roman" w:hAnsi="Times New Roman"/>
           <w:sz w:val="22"/>
         </w:rPr>
-        <w:t xml:space="preserve">PRADO, Sérgio.</w:t>
-      </w:r>
-      <w:r>
-        <w:rPr>
-          <w:rFonts w:ascii="Times New Roman" w:hAnsi="Times New Roman"/>
-          <w:sz w:val="22"/>
-        </w:rPr>
-        <w:t xml:space="preserve"> </w:t>
-      </w:r>
-      <w:r>
-        <w:rPr>
-          <w:rFonts w:ascii="Times New Roman" w:hAnsi="Times New Roman"/>
-          <w:i/>
-          <w:iCs/>
-          <w:sz w:val="22"/>
-        </w:rPr>
-        <w:t xml:space="preserve">A dimensão federativa da reforma tributária: uma síntese didática e vários pontos críticos</w:t>
-      </w:r>
-      <w:r>
-        <w:rPr>
-          <w:rFonts w:ascii="Times New Roman" w:hAnsi="Times New Roman"/>
-          <w:sz w:val="22"/>
-        </w:rPr>
-        <w:t xml:space="preserve">. Redação final. [S. l.]: [s. n.], jun. 2025. Disponível em:</w:t>
-      </w:r>
-      <w:r>
-        <w:rPr>
-          <w:rFonts w:ascii="Times New Roman" w:hAnsi="Times New Roman"/>
-          <w:sz w:val="22"/>
-        </w:rPr>
-        <w:t xml:space="preserve"> </w:t>
-      </w:r>
-      <w:hyperlink r:id="rId55">
-        <w:r>
-          <w:rPr>
-            <w:rStyle w:val="Hyperlink"/>
-          </w:rPr>
-          <w:t xml:space="preserve">https://www.joserobertoafonso.com.br/wp-content/uploads/2025/08/A_DIMENSAO_FEDERATIVA_DA_REFORMA_TRIBUTARIA.pdf</w:t>
-        </w:r>
-      </w:hyperlink>
-      <w:r>
-        <w:rPr>
-          <w:rFonts w:ascii="Times New Roman" w:hAnsi="Times New Roman"/>
-          <w:sz w:val="22"/>
-        </w:rPr>
-        <w:t xml:space="preserve">. Acesso em: 10 jun. 2026.</w:t>
-      </w:r>
-    </w:p>
-    <w:p>
-      <w:pPr>
-        <w:pStyle w:val="BodyText"/>
-        <w:spacing w:line="240" w:lineRule="auto" w:before="0" w:after="160"/>
-        <w:ind w:firstLine="0"/>
-        <w:jc w:val="left"/>
-      </w:pPr>
-      <w:r>
-        <w:rPr>
-          <w:rFonts w:ascii="Times New Roman" w:hAnsi="Times New Roman"/>
-          <w:sz w:val="22"/>
-        </w:rPr>
-        <w:t xml:space="preserve">ROSEN, Harvey S.; GAYER, Ted.</w:t>
-      </w:r>
-      <w:r>
-        <w:rPr>
-          <w:rFonts w:ascii="Times New Roman" w:hAnsi="Times New Roman"/>
-          <w:sz w:val="22"/>
-        </w:rPr>
-        <w:t xml:space="preserve"> </w:t>
-      </w:r>
-      <w:r>
-        <w:rPr>
-          <w:rFonts w:ascii="Times New Roman" w:hAnsi="Times New Roman"/>
-          <w:i/>
-          <w:iCs/>
-          <w:sz w:val="22"/>
-        </w:rPr>
-        <w:t xml:space="preserve">Public finance</w:t>
-      </w:r>
-      <w:r>
-        <w:rPr>
-          <w:rFonts w:ascii="Times New Roman" w:hAnsi="Times New Roman"/>
-          <w:sz w:val="22"/>
-        </w:rPr>
-        <w:t xml:space="preserve">. 10. ed. New York: McGraw-Hill, 2014.</w:t>
-      </w:r>
-    </w:p>
-    <w:p>
-      <w:pPr>
-        <w:pStyle w:val="BodyText"/>
-        <w:spacing w:line="240" w:lineRule="auto" w:before="0" w:after="160"/>
-        <w:ind w:firstLine="0"/>
-        <w:jc w:val="left"/>
-      </w:pPr>
-      <w:r>
-        <w:rPr>
-          <w:rFonts w:ascii="Times New Roman" w:hAnsi="Times New Roman"/>
-          <w:sz w:val="22"/>
-        </w:rPr>
-        <w:t xml:space="preserve">SECRETARIA DO TESOURO NACIONAL (STN).</w:t>
-      </w:r>
-      <w:r>
-        <w:rPr>
-          <w:rFonts w:ascii="Times New Roman" w:hAnsi="Times New Roman"/>
-          <w:sz w:val="22"/>
-        </w:rPr>
-        <w:t xml:space="preserve"> </w:t>
-      </w:r>
-      <w:r>
-        <w:rPr>
-          <w:rFonts w:ascii="Times New Roman" w:hAnsi="Times New Roman"/>
-          <w:i/>
-          <w:iCs/>
-          <w:sz w:val="22"/>
-        </w:rPr>
-        <w:t xml:space="preserve">Siconfi: Sistema de Informações Contábeis e Fiscais do Setor Público Brasileiro</w:t>
-      </w:r>
-      <w:r>
-        <w:rPr>
-          <w:rFonts w:ascii="Times New Roman" w:hAnsi="Times New Roman"/>
-          <w:sz w:val="22"/>
-        </w:rPr>
-        <w:t xml:space="preserve">. Declaração de Contas Anuais, </w:t>
-      </w:r>
-      <w:r>
-        <w:rPr>
-          <w:rFonts w:ascii="Times New Roman" w:hAnsi="Times New Roman"/>
-          <w:sz w:val="22"/>
-        </w:rPr>
-        <w:t>Anexo I-C, 2019 a 2025, e Relatório Resumido da Execução Orçamentária (RREO), 2026.</w:t>
-      </w:r>
-      <w:r>
-        <w:rPr>
-          <w:rFonts w:ascii="Times New Roman" w:hAnsi="Times New Roman"/>
-          <w:sz w:val="22"/>
-        </w:rPr>
-        <w:t xml:space="preserve"> Brasília, DF: STN, 2026. Disponível em:</w:t>
-      </w:r>
-      <w:r>
-        <w:rPr>
-          <w:rFonts w:ascii="Times New Roman" w:hAnsi="Times New Roman"/>
-          <w:sz w:val="22"/>
-        </w:rPr>
-        <w:t xml:space="preserve"> </w:t>
-      </w:r>
-      <w:hyperlink r:id="rId56">
-        <w:r>
-          <w:rPr>
-            <w:rStyle w:val="Hyperlink"/>
-          </w:rPr>
-          <w:t xml:space="preserve">https://siconfi.tesouro.gov.br/</w:t>
-        </w:r>
-      </w:hyperlink>
-      <w:r>
-        <w:rPr>
-          <w:rFonts w:ascii="Times New Roman" w:hAnsi="Times New Roman"/>
-          <w:sz w:val="22"/>
-        </w:rPr>
-        <w:t xml:space="preserve">. Acesso em: 8 ago. 2026.</w:t>
-      </w:r>
-    </w:p>
-    <w:p>
-      <w:pPr>
-        <w:pStyle w:val="BodyText"/>
-        <w:spacing w:line="240" w:lineRule="auto" w:before="0" w:after="160"/>
-        <w:ind w:firstLine="0"/>
-        <w:jc w:val="left"/>
-      </w:pPr>
-      <w:r>
-        <w:rPr>
-          <w:rFonts w:ascii="Times New Roman" w:hAnsi="Times New Roman"/>
-          <w:sz w:val="22"/>
-        </w:rPr>
-        <w:t xml:space="preserve">TER-MINASSIAN, Teresa (org.).</w:t>
-      </w:r>
-      <w:r>
-        <w:rPr>
-          <w:rFonts w:ascii="Times New Roman" w:hAnsi="Times New Roman"/>
-          <w:sz w:val="22"/>
-        </w:rPr>
-        <w:t xml:space="preserve"> </w:t>
-      </w:r>
-      <w:r>
-        <w:rPr>
-          <w:rFonts w:ascii="Times New Roman" w:hAnsi="Times New Roman"/>
-          <w:i/>
-          <w:iCs/>
-          <w:sz w:val="22"/>
-        </w:rPr>
-        <w:t xml:space="preserve">Fiscal federalism in theory and practice</w:t>
-      </w:r>
-      <w:r>
-        <w:rPr>
-          <w:rFonts w:ascii="Times New Roman" w:hAnsi="Times New Roman"/>
-          <w:sz w:val="22"/>
-        </w:rPr>
-        <w:t xml:space="preserve">. Washington, DC: International Monetary Fund, 1997.</w:t>
-      </w:r>
-    </w:p>
-    <w:p>
-      <w:pPr>
-        <w:pStyle w:val="BodyText"/>
-        <w:spacing w:line="240" w:lineRule="auto" w:before="0" w:after="160"/>
-        <w:ind w:firstLine="0"/>
-        <w:jc w:val="left"/>
-      </w:pPr>
-      <w:r>
-        <w:rPr>
-          <w:rFonts w:ascii="Times New Roman" w:hAnsi="Times New Roman"/>
-          <w:sz w:val="22"/>
-        </w:rPr>
         <w:t xml:space="preserve">TRIBUNAL DE CONTAS DO ESTADO DO PARANÁ (TCE-PR).</w:t>
       </w:r>
       <w:r>
@@ -14605,44 +14627,6 @@
           <w:sz w:val="22"/>
         </w:rPr>
         <w:t xml:space="preserve">. Acesso em: 30 set. 2026.</w:t>
-      </w:r>
-    </w:p>
-    <w:p>
-      <w:pPr>
-        <w:pStyle w:val="BodyText"/>
-        <w:spacing w:line="240" w:lineRule="auto" w:before="0" w:after="160"/>
-        <w:ind w:firstLine="0"/>
-        <w:jc w:val="left"/>
-      </w:pPr>
-      <w:r>
-        <w:rPr>
-          <w:rFonts w:ascii="Times New Roman" w:hAnsi="Times New Roman"/>
-          <w:sz w:val="22"/>
-        </w:rPr>
-        <w:t xml:space="preserve">VARSANO, Ricardo. A guerra fiscal do ICMS: quem ganha e quem perde.</w:t>
-      </w:r>
-      <w:r>
-        <w:rPr>
-          <w:rFonts w:ascii="Times New Roman" w:hAnsi="Times New Roman"/>
-          <w:sz w:val="22"/>
-        </w:rPr>
-        <w:t xml:space="preserve"> </w:t>
-      </w:r>
-      <w:r>
-        <w:rPr>
-          <w:rFonts w:ascii="Times New Roman" w:hAnsi="Times New Roman"/>
-          <w:i/>
-          <w:iCs/>
-          <w:sz w:val="22"/>
-        </w:rPr>
-        <w:t xml:space="preserve">Planejamento e Políticas Públicas</w:t>
-      </w:r>
-      <w:r>
-        <w:rPr>
-          <w:rFonts w:ascii="Times New Roman" w:hAnsi="Times New Roman"/>
-          <w:sz w:val="22"/>
-        </w:rPr>
-        <w:t xml:space="preserve">, Brasília, DF: Instituto de Pesquisa Econômica Aplicada, n. 15, p. 13-18, 1997.</w:t>
       </w:r>
     </w:p>
     <w:bookmarkEnd w:id="58"/>

</xml_diff>